<commit_message>
Add One Way Web Designs details and full Signature scope
Fill in the provider details. Add a section listing everything in
the Signature package: premium design, 4K hero video, photo
enhancement, Shopify payments, SEO/AEO/GEO, contact forms and the
AI assistant. Align the terms with onewaywebdesign.com (no monthly
hosting fee, 90 days' support), add AI assistant safeguards and set
governing law to Victoria. ABN, bank details and GST status are
still placeholders.

Co-Authored-By: Claude Opus 5.5 <noreply@anthropic.com>
Claude-Session: https://claude.ai/code/session_01BBnyaZa42WH2PghUY2mMrv
</commit_message>
<xml_diff>
--- a/cosmo-lighting/Cosmo-Lighting-Invoice-INV-CLK-001.docx
+++ b/cosmo-lighting/Cosmo-Lighting-Invoice-INV-CLK-001.docx
@@ -47,10 +47,8 @@
                 <w:color w:val="1F2A37"/>
                 <w:sz w:val="30"/>
                 <w:szCs w:val="30"/>
-                <w:highlight w:val="yellow"/>
-                <w:highlightCs w:val="yellow"/>
-              </w:rPr>
-              <w:t xml:space="preserve">[YOUR BUSINESS NAME]</w:t>
+              </w:rPr>
+              <w:t xml:space="preserve">One Way Web Designs</w:t>
             </w:r>
           </w:p>
           <w:p>
@@ -94,7 +92,7 @@
           </w:p>
           <w:p>
             <w:pPr>
-              <w:spacing w:after="0" w:before="0" w:line="276" w:lineRule="auto"/>
+              <w:spacing w:after="20" w:before="0" w:line="276" w:lineRule="auto"/>
             </w:pPr>
             <w:r>
               <w:rPr>
@@ -102,11 +100,14 @@
                 <w:color w:val="5F6670"/>
                 <w:sz w:val="18"/>
                 <w:szCs w:val="18"/>
-                <w:highlight w:val="yellow"/>
-                <w:highlightCs w:val="yellow"/>
-              </w:rPr>
-              <w:t xml:space="preserve">[YOUR EMAIL]</w:t>
-            </w:r>
+              </w:rPr>
+              <w:t xml:space="preserve">keaton.dunn@outlook.com  ·  0434 955 607</w:t>
+            </w:r>
+          </w:p>
+          <w:p>
+            <w:pPr>
+              <w:spacing w:after="0" w:before="0" w:line="276" w:lineRule="auto"/>
+            </w:pPr>
             <w:r>
               <w:rPr>
                 <w:rFonts w:ascii="Arial" w:cs="Arial" w:eastAsia="Arial" w:hAnsi="Arial"/>
@@ -114,18 +115,7 @@
                 <w:sz w:val="18"/>
                 <w:szCs w:val="18"/>
               </w:rPr>
-              <w:t xml:space="preserve">  ·  </w:t>
-            </w:r>
-            <w:r>
-              <w:rPr>
-                <w:rFonts w:ascii="Arial" w:cs="Arial" w:eastAsia="Arial" w:hAnsi="Arial"/>
-                <w:color w:val="5F6670"/>
-                <w:sz w:val="18"/>
-                <w:szCs w:val="18"/>
-                <w:highlight w:val="yellow"/>
-                <w:highlightCs w:val="yellow"/>
-              </w:rPr>
-              <w:t xml:space="preserve">[YOUR PHONE]</w:t>
+              <w:t xml:space="preserve">onewaywebdesign.com</w:t>
             </w:r>
           </w:p>
         </w:tc>
@@ -458,7 +448,7 @@
     </w:tbl>
     <w:p>
       <w:pPr>
-        <w:spacing w:after="200" w:before="0"/>
+        <w:spacing w:after="160" w:before="0"/>
       </w:pPr>
     </w:p>
     <w:tbl>
@@ -574,7 +564,7 @@
     </w:tbl>
     <w:p>
       <w:pPr>
-        <w:spacing w:after="200" w:before="0"/>
+        <w:spacing w:after="180" w:before="0"/>
       </w:pPr>
     </w:p>
     <w:tbl>
@@ -716,7 +706,7 @@
                 <w:sz w:val="17"/>
                 <w:szCs w:val="17"/>
               </w:rPr>
-              <w:t xml:space="preserve">Full website rebuild. Existing Shopify checkout and payment methods retained. Website hosting included.</w:t>
+              <w:t xml:space="preserve">Premium design with 4K hero video and photo enhancement, Shopify payment integration, SEO, AEO and GEO, contact forms, AI assistant, hosting with no monthly fee, and 90 days’ support.</w:t>
             </w:r>
           </w:p>
         </w:tc>
@@ -1876,7 +1866,7 @@
     </w:tbl>
     <w:p>
       <w:pPr>
-        <w:spacing w:after="160" w:before="0"/>
+        <w:spacing w:after="140" w:before="0"/>
       </w:pPr>
     </w:p>
     <w:p>
@@ -1901,7 +1891,7 @@
           <w:sz w:val="17"/>
           <w:szCs w:val="17"/>
         </w:rPr>
-        <w:t xml:space="preserve">not part of this invoice. The $50/month or $500/year Care Plan is entirely optional and does not include hosting, which is already included in your Signature Website Package. See section 3 of your agreement.</w:t>
+        <w:t xml:space="preserve">not part of this invoice. It’s entirely optional ($50/month or $500/year) and doesn’t include hosting. See section 4 of your agreement.</w:t>
       </w:r>
     </w:p>
     <w:p>
@@ -1914,19 +1904,10 @@
           <w:color w:val="5F6670"/>
           <w:sz w:val="17"/>
           <w:szCs w:val="17"/>
-        </w:rPr>
-        <w:t xml:space="preserve">No GST is charged. </w:t>
-      </w:r>
-      <w:r>
-        <w:rPr>
-          <w:rFonts w:ascii="Arial" w:cs="Arial" w:eastAsia="Arial" w:hAnsi="Arial"/>
-          <w:color w:val="5F6670"/>
-          <w:sz w:val="17"/>
-          <w:szCs w:val="17"/>
           <w:highlight w:val="yellow"/>
           <w:highlightCs w:val="yellow"/>
         </w:rPr>
-        <w:t xml:space="preserve">[YOUR BUSINESS NAME]</w:t>
+        <w:t xml:space="preserve">[CONFIRM GST STATUS]</w:t>
       </w:r>
       <w:r>
         <w:rPr>
@@ -1935,27 +1916,7 @@
           <w:sz w:val="17"/>
           <w:szCs w:val="17"/>
         </w:rPr>
-        <w:t xml:space="preserve"> is not registered for GST.  Thank you for choosing </w:t>
-      </w:r>
-      <w:r>
-        <w:rPr>
-          <w:rFonts w:ascii="Arial" w:cs="Arial" w:eastAsia="Arial" w:hAnsi="Arial"/>
-          <w:color w:val="5F6670"/>
-          <w:sz w:val="17"/>
-          <w:szCs w:val="17"/>
-          <w:highlight w:val="yellow"/>
-          <w:highlightCs w:val="yellow"/>
-        </w:rPr>
-        <w:t xml:space="preserve">[YOUR BUSINESS NAME]</w:t>
-      </w:r>
-      <w:r>
-        <w:rPr>
-          <w:rFonts w:ascii="Arial" w:cs="Arial" w:eastAsia="Arial" w:hAnsi="Arial"/>
-          <w:color w:val="5F6670"/>
-          <w:sz w:val="17"/>
-          <w:szCs w:val="17"/>
-        </w:rPr>
-        <w:t xml:space="preserve">.</w:t>
+        <w:t xml:space="preserve"> No GST is charged. One Way Web Designs is not registered for GST.  Thank you for choosing One Way Web Designs.</w:t>
       </w:r>
     </w:p>
     <w:sectPr>

</xml_diff>

<commit_message>
Bundle sync agent and shipping calculator at $600; add ABN
Merge the Supplier Sync Agent and the Postcode Shipping Calculator into
one $600 line item, bringing the total to $2,000 with a $1,000
deposit. Fill in the ABN, update the contact email and confirm that
GST is not charged. Scope descriptions now live in config.json.

Co-Authored-By: Claude Opus 5.5 <noreply@anthropic.com>
Claude-Session: https://claude.ai/code/session_01BBnyaZa42WH2PghUY2mMrv
</commit_message>
<xml_diff>
--- a/cosmo-lighting/Cosmo-Lighting-Invoice-INV-CLK-001.docx
+++ b/cosmo-lighting/Cosmo-Lighting-Invoice-INV-CLK-001.docx
@@ -76,32 +76,21 @@
                 <w:sz w:val="18"/>
                 <w:szCs w:val="18"/>
               </w:rPr>
-              <w:t xml:space="preserve">ABN </w:t>
-            </w:r>
+              <w:t xml:space="preserve">ABN 99 772 930 609</w:t>
+            </w:r>
+          </w:p>
+          <w:p>
+            <w:pPr>
+              <w:spacing w:after="20" w:before="0" w:line="276" w:lineRule="auto"/>
+            </w:pPr>
             <w:r>
               <w:rPr>
                 <w:rFonts w:ascii="Arial" w:cs="Arial" w:eastAsia="Arial" w:hAnsi="Arial"/>
                 <w:color w:val="5F6670"/>
                 <w:sz w:val="18"/>
                 <w:szCs w:val="18"/>
-                <w:highlight w:val="yellow"/>
-                <w:highlightCs w:val="yellow"/>
-              </w:rPr>
-              <w:t xml:space="preserve">[YOUR ABN]</w:t>
-            </w:r>
-          </w:p>
-          <w:p>
-            <w:pPr>
-              <w:spacing w:after="20" w:before="0" w:line="276" w:lineRule="auto"/>
-            </w:pPr>
-            <w:r>
-              <w:rPr>
-                <w:rFonts w:ascii="Arial" w:cs="Arial" w:eastAsia="Arial" w:hAnsi="Arial"/>
-                <w:color w:val="5F6670"/>
-                <w:sz w:val="18"/>
-                <w:szCs w:val="18"/>
-              </w:rPr>
-              <w:t xml:space="preserve">keaton.dunn@outlook.com  ·  0434 955 607</w:t>
+              </w:rPr>
+              <w:t xml:space="preserve">keaton.dunn08@gmail.com  ·  0434 955 607</w:t>
             </w:r>
           </w:p>
           <w:p>
@@ -779,7 +768,7 @@
                 <w:sz w:val="20"/>
                 <w:szCs w:val="20"/>
               </w:rPr>
-              <w:t xml:space="preserve">Supplier Sync Agent</w:t>
+              <w:t xml:space="preserve">Supplier Sync Agent + Postcode Shipping Calculator</w:t>
             </w:r>
           </w:p>
           <w:p>
@@ -793,7 +782,7 @@
                 <w:sz w:val="17"/>
                 <w:szCs w:val="17"/>
               </w:rPr>
-              <w:t xml:space="preserve">Live pricing, product range and stock status from Oz Lighting and Lighting Outlet, with freight costs built into your pricing rules.</w:t>
+              <w:t xml:space="preserve">Live pricing, product range and stock status from Oz Lighting and Lighting Outlet, with freight built into your pricing, plus Australia Post delivery costs calculated from the customer’s postcode.</w:t>
             </w:r>
           </w:p>
         </w:tc>
@@ -828,94 +817,7 @@
                 <w:sz w:val="20"/>
                 <w:szCs w:val="20"/>
               </w:rPr>
-              <w:t xml:space="preserve">$500.00</w:t>
-            </w:r>
-          </w:p>
-        </w:tc>
-      </w:tr>
-      <w:tr>
-        <w:trPr>
-          <w:cantSplit/>
-        </w:trPr>
-        <w:tc>
-          <w:tcPr>
-            <w:tcW w:type="dxa" w:w="7838"/>
-            <w:tcBorders>
-              <w:top w:val="none" w:color="FFFFFF" w:sz="0"/>
-              <w:left w:val="none" w:color="FFFFFF" w:sz="0"/>
-              <w:bottom w:val="single" w:color="D8D2C4" w:sz="4"/>
-              <w:right w:val="none" w:color="FFFFFF" w:sz="0"/>
-            </w:tcBorders>
-            <w:tcMar>
-              <w:top w:type="dxa" w:w="80"/>
-              <w:left w:type="dxa" w:w="150"/>
-              <w:bottom w:type="dxa" w:w="80"/>
-              <w:right w:type="dxa" w:w="150"/>
-            </w:tcMar>
-          </w:tcPr>
-          <w:p>
-            <w:pPr>
-              <w:spacing w:after="20" w:before="0" w:line="276" w:lineRule="auto"/>
-            </w:pPr>
-            <w:r>
-              <w:rPr>
-                <w:rFonts w:ascii="Arial" w:cs="Arial" w:eastAsia="Arial" w:hAnsi="Arial"/>
-                <w:b/>
-                <w:bCs/>
-                <w:color w:val="1F2A37"/>
-                <w:sz w:val="20"/>
-                <w:szCs w:val="20"/>
-              </w:rPr>
-              <w:t xml:space="preserve">Postcode Shipping Calculator</w:t>
-            </w:r>
-          </w:p>
-          <w:p>
-            <w:pPr>
-              <w:spacing w:after="0" w:before="0" w:line="252" w:lineRule="auto"/>
-            </w:pPr>
-            <w:r>
-              <w:rPr>
-                <w:rFonts w:ascii="Arial" w:cs="Arial" w:eastAsia="Arial" w:hAnsi="Arial"/>
-                <w:color w:val="5F6670"/>
-                <w:sz w:val="17"/>
-                <w:szCs w:val="17"/>
-              </w:rPr>
-              <w:t xml:space="preserve">Australia Post delivery cost calculated automatically from the customer’s postcode.</w:t>
-            </w:r>
-          </w:p>
-        </w:tc>
-        <w:tc>
-          <w:tcPr>
-            <w:tcW w:type="dxa" w:w="1800"/>
-            <w:tcBorders>
-              <w:top w:val="none" w:color="FFFFFF" w:sz="0"/>
-              <w:left w:val="none" w:color="FFFFFF" w:sz="0"/>
-              <w:bottom w:val="single" w:color="D8D2C4" w:sz="4"/>
-              <w:right w:val="none" w:color="FFFFFF" w:sz="0"/>
-            </w:tcBorders>
-            <w:tcMar>
-              <w:top w:type="dxa" w:w="80"/>
-              <w:left w:type="dxa" w:w="150"/>
-              <w:bottom w:type="dxa" w:w="80"/>
-              <w:right w:type="dxa" w:w="150"/>
-            </w:tcMar>
-            <w:vAlign w:val="center"/>
-          </w:tcPr>
-          <w:p>
-            <w:pPr>
-              <w:spacing w:after="0" w:before="0" w:line="276" w:lineRule="auto"/>
-              <w:jc w:val="right"/>
-            </w:pPr>
-            <w:r>
-              <w:rPr>
-                <w:rFonts w:ascii="Arial" w:cs="Arial" w:eastAsia="Arial" w:hAnsi="Arial"/>
-                <w:b/>
-                <w:bCs/>
-                <w:color w:val="1F2A37"/>
-                <w:sz w:val="20"/>
-                <w:szCs w:val="20"/>
-              </w:rPr>
-              <w:t xml:space="preserve">Included</w:t>
+              <w:t xml:space="preserve">$600.00</w:t>
             </w:r>
           </w:p>
         </w:tc>
@@ -1112,7 +1014,7 @@
                 <w:sz w:val="19"/>
                 <w:szCs w:val="19"/>
               </w:rPr>
-              <w:t xml:space="preserve">$1,900.00</w:t>
+              <w:t xml:space="preserve">$2,000.00</w:t>
             </w:r>
           </w:p>
         </w:tc>
@@ -1290,7 +1192,7 @@
                 <w:sz w:val="22"/>
                 <w:szCs w:val="22"/>
               </w:rPr>
-              <w:t xml:space="preserve">$1,900.00</w:t>
+              <w:t xml:space="preserve">$2,000.00</w:t>
             </w:r>
           </w:p>
         </w:tc>
@@ -1532,7 +1434,7 @@
                 <w:sz w:val="20"/>
                 <w:szCs w:val="20"/>
               </w:rPr>
-              <w:t xml:space="preserve">$950.00</w:t>
+              <w:t xml:space="preserve">$1,000.00</w:t>
             </w:r>
           </w:p>
         </w:tc>
@@ -1628,7 +1530,7 @@
                 <w:sz w:val="20"/>
                 <w:szCs w:val="20"/>
               </w:rPr>
-              <w:t xml:space="preserve">$950.00</w:t>
+              <w:t xml:space="preserve">$1,000.00</w:t>
             </w:r>
           </w:p>
         </w:tc>
@@ -1703,7 +1605,7 @@
                 <w:sz w:val="40"/>
                 <w:szCs w:val="40"/>
               </w:rPr>
-              <w:t xml:space="preserve">$950.00 AUD</w:t>
+              <w:t xml:space="preserve">$1,000.00 AUD</w:t>
             </w:r>
           </w:p>
           <w:p>
@@ -1904,19 +1806,8 @@
           <w:color w:val="5F6670"/>
           <w:sz w:val="17"/>
           <w:szCs w:val="17"/>
-          <w:highlight w:val="yellow"/>
-          <w:highlightCs w:val="yellow"/>
         </w:rPr>
-        <w:t xml:space="preserve">[CONFIRM GST STATUS]</w:t>
-      </w:r>
-      <w:r>
-        <w:rPr>
-          <w:rFonts w:ascii="Arial" w:cs="Arial" w:eastAsia="Arial" w:hAnsi="Arial"/>
-          <w:color w:val="5F6670"/>
-          <w:sz w:val="17"/>
-          <w:szCs w:val="17"/>
-        </w:rPr>
-        <w:t xml:space="preserve"> No GST is charged. One Way Web Designs is not registered for GST.  Thank you for choosing One Way Web Designs.</w:t>
+        <w:t xml:space="preserve">No GST is charged. One Way Web Designs is not registered for GST.  Thank you for choosing One Way Web Designs.</w:t>
       </w:r>
     </w:p>
     <w:sectPr>

</xml_diff>